<commit_message>
Docs: modificacion de documento v2
</commit_message>
<xml_diff>
--- a/docs/entrega_01/reference.docx
+++ b/docs/entrega_01/reference.docx
@@ -1,6 +1,6 @@
 
 <file path=word/document.xml><?xml version="1.0" encoding="utf-8"?>
-<w:document xmlns:w="http://schemas.openxmlformats.org/wordprocessingml/2006/main" xmlns:m="http://schemas.openxmlformats.org/officeDocument/2006/math" xmlns:r="http://schemas.openxmlformats.org/officeDocument/2006/relationships" xmlns:o="urn:schemas-microsoft-com:office:office" xmlns:v="urn:schemas-microsoft-com:vml" xmlns:w10="urn:schemas-microsoft-com:office:word" xmlns:a="http://schemas.openxmlformats.org/drawingml/2006/main" xmlns:pic="http://schemas.openxmlformats.org/drawingml/2006/picture" xmlns:wp="http://schemas.openxmlformats.org/drawingml/2006/wordprocessingDrawing">
+<w:document xmlns:r="http://schemas.openxmlformats.org/officeDocument/2006/relationships" xmlns:w="http://schemas.openxmlformats.org/wordprocessingml/2006/main">
   <w:body>
     <w:p>
       <w:pPr>
@@ -315,7 +315,7 @@
     </w:p>
     <w:sectPr>
       <w:pgSz w:w="11906" w:h="16838"/>
-      <w:pgMar w:top="1418" w:right="1418" w:bottom="1418" w:left="1418" w:header="708" w:footer="708" w:gutter="0"/>
+      <w:pgMar w:top="1077" w:right="1077" w:bottom="1077" w:left="1077" w:header="708" w:footer="708" w:gutter="0"/>
       <w:footnotePr>
         <w:numRestart w:val="eachSect"/>
       </w:footnotePr>
@@ -483,19 +483,19 @@
 </file>
 
 <file path=word/styles.xml><?xml version="1.0" encoding="utf-8"?>
-<w:styles xmlns:r="http://schemas.openxmlformats.org/officeDocument/2006/relationships" xmlns:w="http://schemas.openxmlformats.org/wordprocessingml/2006/main">
+<w:styles xmlns:w="http://schemas.openxmlformats.org/wordprocessingml/2006/main">
   <w:docDefaults>
     <w:rPrDefault>
       <w:rPr>
         <w:rFonts w:ascii="Times New Roman" w:hAnsi="Times New Roman" w:cs="Times New Roman"/>
-        <w:sz w:val="24"/>
-        <w:szCs w:val="24"/>
+        <w:sz w:val="21"/>
+        <w:szCs w:val="21"/>
         <w:lang w:val="es-PE" w:eastAsia="es-PE" w:bidi="ar-SA"/>
       </w:rPr>
     </w:rPrDefault>
     <w:pPrDefault>
       <w:pPr>
-        <w:spacing w:after="120" w:line="360" w:lineRule="auto"/>
+        <w:spacing w:after="40" w:line="248" w:lineRule="auto"/>
       </w:pPr>
     </w:pPrDefault>
   </w:docDefaults>
@@ -671,7 +671,7 @@
     <w:pPr>
       <w:keepNext/>
       <w:keepLines/>
-      <w:spacing w:before="360" w:after="80"/>
+      <w:spacing w:before="140" w:after="50"/>
       <w:outlineLvl w:val="0"/>
     </w:pPr>
     <w:rPr>
@@ -694,7 +694,7 @@
     <w:pPr>
       <w:keepNext/>
       <w:keepLines/>
-      <w:spacing w:before="160" w:after="80"/>
+      <w:spacing w:before="100" w:after="30"/>
       <w:outlineLvl w:val="1"/>
     </w:pPr>
     <w:rPr>
@@ -717,7 +717,7 @@
     <w:pPr>
       <w:keepNext/>
       <w:keepLines/>
-      <w:spacing w:before="160" w:after="80"/>
+      <w:spacing w:before="70" w:after="20"/>
       <w:outlineLvl w:val="2"/>
     </w:pPr>
     <w:rPr>
@@ -740,7 +740,7 @@
     <w:pPr>
       <w:keepNext/>
       <w:keepLines/>
-      <w:spacing w:before="80" w:after="40"/>
+      <w:spacing w:before="50" w:after="15"/>
       <w:outlineLvl w:val="3"/>
     </w:pPr>
     <w:rPr>
@@ -1038,6 +1038,13 @@
         <w:vAlign w:val="bottom"/>
       </w:tcPr>
     </w:tblStylePr>
+    <w:rPr>
+      <w:sz w:val="18"/>
+      <w:szCs w:val="18"/>
+    </w:rPr>
+    <w:pPr>
+      <w:spacing w:after="0" w:line="240"/>
+    </w:pPr>
   </w:style>
   <w:style w:type="paragraph" w:customStyle="1" w:styleId="DefinitionTerm">
     <w:name w:val="Definition Term"/>

</xml_diff>